<commit_message>
feat: AST 层题注标记(lua filter) + PDF 版式快照回归 + 18 项测试
</commit_message>
<xml_diff>
--- a/ref.docx
+++ b/ref.docx
@@ -1372,6 +1372,21 @@
       <w:rFonts w:ascii="Times New Roman" w:hAnsi="Times New Roman" w:eastAsia="宋体" w:cs="Times New Roman"/>
       <w:b w:val="0"/>
       <w:sz w:val="24"/>
+    </w:rPr>
+  </w:style>
+  <w:style w:type="paragraph" w:customStyle="1" w:styleId="FigureCaption">
+    <w:name w:val="FigureCaption"/>
+    <w:basedOn w:val="Normal"/>
+    <w:qFormat/>
+    <w:pPr>
+      <w:spacing w:before="60" w:after="200" w:line="240" w:lineRule="auto"/>
+      <w:jc w:val="center"/>
+    </w:pPr>
+    <w:rPr>
+      <w:rFonts w:ascii="Times New Roman" w:hAnsi="Times New Roman" w:eastAsia="宋体" w:cs="Times New Roman"/>
+      <w:b w:val="0"/>
+      <w:color w:val="404040"/>
+      <w:sz w:val="21"/>
     </w:rPr>
   </w:style>
 </w:styles>

</xml_diff>